<commit_message>
Feature: Work on document creation
</commit_message>
<xml_diff>
--- a/src/public/docx-templates/standard-quote-template.docx
+++ b/src/public/docx-templates/standard-quote-template.docx
@@ -4,16 +4,70 @@
   <w:body>
     <w:p>
       <w:pPr>
-        <w:rPr>
-          <w:b w:val="1"/>
-        </w:rPr>
-      </w:pPr>
-      <w:r>
-        <w:rPr>
-          <w:b w:val="1"/>
-          <w:rtl w:val="0"/>
-        </w:rPr>
-        <w:t xml:space="preserve">{{greeting}}</w:t>
+        <w:pStyle w:val="Heading3"/>
+        <w:rPr>
+          <w:color w:val="000000"/>
+        </w:rPr>
+      </w:pPr>
+      <w:bookmarkStart w:colFirst="0" w:colLast="0" w:name="_4bn0qwo36b0" w:id="0"/>
+      <w:bookmarkEnd w:id="0"/>
+      <w:r>
+        <w:rPr>
+          <w:color w:val="000000"/>
+          <w:rtl w:val="0"/>
+        </w:rPr>
+        <w:t xml:space="preserve">{{date}}</w:t>
+      </w:r>
+    </w:p>
+    <w:p>
+      <w:pPr>
+        <w:pStyle w:val="Heading3"/>
+        <w:rPr>
+          <w:color w:val="000000"/>
+        </w:rPr>
+      </w:pPr>
+      <w:bookmarkStart w:colFirst="0" w:colLast="0" w:name="_wompn916x9fu" w:id="1"/>
+      <w:bookmarkEnd w:id="1"/>
+      <w:r>
+        <w:rPr>
+          <w:color w:val="000000"/>
+          <w:rtl w:val="0"/>
+        </w:rPr>
+        <w:t xml:space="preserve">{{company_logo}}</w:t>
+      </w:r>
+    </w:p>
+    <w:p>
+      <w:pPr>
+        <w:pStyle w:val="Heading3"/>
+        <w:rPr>
+          <w:color w:val="000000"/>
+        </w:rPr>
+      </w:pPr>
+      <w:bookmarkStart w:colFirst="0" w:colLast="0" w:name="_2njitfut8wb4" w:id="2"/>
+      <w:bookmarkEnd w:id="2"/>
+      <w:r>
+        <w:rPr>
+          <w:color w:val="000000"/>
+          <w:rtl w:val="0"/>
+        </w:rPr>
+        <w:t xml:space="preserve">{{company_name}}</w:t>
+      </w:r>
+    </w:p>
+    <w:p>
+      <w:pPr>
+        <w:pStyle w:val="Heading3"/>
+        <w:rPr>
+          <w:color w:val="000000"/>
+        </w:rPr>
+      </w:pPr>
+      <w:bookmarkStart w:colFirst="0" w:colLast="0" w:name="_ertma321tlat" w:id="3"/>
+      <w:bookmarkEnd w:id="3"/>
+      <w:r>
+        <w:rPr>
+          <w:color w:val="000000"/>
+          <w:rtl w:val="0"/>
+        </w:rPr>
+        <w:t xml:space="preserve">Customer Information:</w:t>
       </w:r>
     </w:p>
     <w:p>
@@ -24,7 +78,7 @@
         <w:rPr>
           <w:rtl w:val="0"/>
         </w:rPr>
-        <w:t xml:space="preserve">{{name}}</w:t>
+        <w:t xml:space="preserve">{{customer_name}}</w:t>
       </w:r>
     </w:p>
     <w:p>
@@ -35,7 +89,7 @@
         <w:rPr>
           <w:rtl w:val="0"/>
         </w:rPr>
-        <w:t xml:space="preserve">{{address}}</w:t>
+        <w:t xml:space="preserve">{{customer_email}}</w:t>
       </w:r>
     </w:p>
     <w:p>
@@ -46,18 +100,35 @@
         <w:rPr>
           <w:rtl w:val="0"/>
         </w:rPr>
-      </w:r>
-    </w:p>
-    <w:p>
-      <w:pPr>
-        <w:jc w:val="right"/>
+        <w:t xml:space="preserve">{{customer_phone}}</w:t>
+      </w:r>
+    </w:p>
+    <w:p>
+      <w:pPr>
         <w:rPr/>
       </w:pPr>
       <w:r>
         <w:rPr>
           <w:rtl w:val="0"/>
         </w:rPr>
-        <w:t xml:space="preserve">{{heading}}</w:t>
+        <w:t xml:space="preserve">{{customer_address}}</w:t>
+      </w:r>
+    </w:p>
+    <w:p>
+      <w:pPr>
+        <w:pStyle w:val="Heading3"/>
+        <w:rPr>
+          <w:color w:val="000000"/>
+        </w:rPr>
+      </w:pPr>
+      <w:bookmarkStart w:colFirst="0" w:colLast="0" w:name="_ml77jz35j5gl" w:id="4"/>
+      <w:bookmarkEnd w:id="4"/>
+      <w:r>
+        <w:rPr>
+          <w:color w:val="000000"/>
+          <w:rtl w:val="0"/>
+        </w:rPr>
+        <w:t xml:space="preserve">Quotation Details:</w:t>
       </w:r>
     </w:p>
     <w:p>
@@ -68,23 +139,31 @@
         <w:rPr>
           <w:rtl w:val="0"/>
         </w:rPr>
-      </w:r>
-    </w:p>
-    <w:p>
-      <w:pPr>
-        <w:jc w:val="both"/>
+        <w:t xml:space="preserve">{{quotation_table}}</w:t>
+      </w:r>
+    </w:p>
+    <w:p>
+      <w:pPr>
         <w:rPr/>
       </w:pPr>
       <w:r>
         <w:rPr>
           <w:rtl w:val="0"/>
         </w:rPr>
-        <w:t xml:space="preserve">{{description}}</w:t>
-        <w:br w:type="textWrapping"/>
+      </w:r>
+    </w:p>
+    <w:p>
+      <w:pPr>
+        <w:rPr/>
+      </w:pPr>
+      <w:r>
+        <w:rPr>
+          <w:rtl w:val="0"/>
+        </w:rPr>
       </w:r>
     </w:p>
     <w:sectPr>
-      <w:pgSz w:h="16834" w:w="11909" w:orient="portrait"/>
+      <w:pgSz w:h="15840" w:w="12240" w:orient="portrait"/>
       <w:pgMar w:bottom="1440" w:top="1440" w:left="1440" w:right="1440" w:header="720" w:footer="720"/>
       <w:pgNumType w:start="1"/>
     </w:sectPr>
@@ -104,7 +183,7 @@
         <w:rFonts w:ascii="Arial" w:cs="Arial" w:eastAsia="Arial" w:hAnsi="Arial"/>
         <w:sz w:val="22"/>
         <w:szCs w:val="22"/>
-        <w:lang w:val="en_GB"/>
+        <w:lang w:val="en"/>
       </w:rPr>
     </w:rPrDefault>
     <w:pPrDefault>

</xml_diff>